<commit_message>
Add add-task.html page - Moeez (Member 2)
Co-authored-by: Cursor <cursoragent@cursor.com>
</commit_message>
<xml_diff>
--- a/DF_Assignment_04_Spring_2026.docx
+++ b/DF_Assignment_04_Spring_2026.docx
@@ -1024,12 +1024,8 @@
             <w:vAlign w:val="center"/>
           </w:tcPr>
           <w:p>
-            <w:pPr>
-              <w:pStyle w:val="Normal"/>
-              <w:rPr/>
-            </w:pPr>
-            <w:r>
-              <w:rPr/>
+            <w:r>
+              <w:t>Moeez</w:t>
             </w:r>
           </w:p>
         </w:tc>
@@ -1046,12 +1042,8 @@
             <w:vAlign w:val="center"/>
           </w:tcPr>
           <w:p>
-            <w:pPr>
-              <w:pStyle w:val="Normal"/>
-              <w:rPr/>
-            </w:pPr>
-            <w:r>
-              <w:rPr/>
+            <w:r>
+              <w:t>L1f22bscs1084</w:t>
             </w:r>
           </w:p>
         </w:tc>
@@ -1068,12 +1060,8 @@
             <w:vAlign w:val="center"/>
           </w:tcPr>
           <w:p>
-            <w:pPr>
-              <w:pStyle w:val="Normal"/>
-              <w:rPr/>
-            </w:pPr>
-            <w:r>
-              <w:rPr/>
+            <w:r>
+              <w:t>Member</w:t>
             </w:r>
           </w:p>
         </w:tc>
@@ -1090,12 +1078,8 @@
             <w:vAlign w:val="center"/>
           </w:tcPr>
           <w:p>
-            <w:pPr>
-              <w:pStyle w:val="Normal"/>
-              <w:rPr/>
-            </w:pPr>
-            <w:r>
-              <w:rPr/>
+            <w:r>
+              <w:t>add-task.html</w:t>
             </w:r>
           </w:p>
         </w:tc>
@@ -1112,12 +1096,8 @@
             <w:vAlign w:val="center"/>
           </w:tcPr>
           <w:p>
-            <w:pPr>
-              <w:pStyle w:val="Normal"/>
-              <w:rPr/>
-            </w:pPr>
-            <w:r>
-              <w:rPr/>
+            <w:r>
+              <w:t>feature/L1f22bscs1084/add-task</w:t>
             </w:r>
           </w:p>
         </w:tc>
@@ -1134,12 +1114,8 @@
             <w:vAlign w:val="center"/>
           </w:tcPr>
           <w:p>
-            <w:pPr>
-              <w:pStyle w:val="Normal"/>
-              <w:rPr/>
-            </w:pPr>
-            <w:r>
-              <w:rPr/>
+            <w:r>
+              <w:t>No</w:t>
             </w:r>
           </w:p>
         </w:tc>

</xml_diff>

<commit_message>
Add task-list.html page - Ahmad Hassan (Member 3)
Co-authored-by: Cursor <cursoragent@cursor.com>
</commit_message>
<xml_diff>
--- a/DF_Assignment_04_Spring_2026.docx
+++ b/DF_Assignment_04_Spring_2026.docx
@@ -1187,12 +1187,8 @@
             <w:vAlign w:val="center"/>
           </w:tcPr>
           <w:p>
-            <w:pPr>
-              <w:pStyle w:val="Normal"/>
-              <w:rPr/>
-            </w:pPr>
-            <w:r>
-              <w:rPr/>
+            <w:r>
+              <w:t>Ahmad Hassan</w:t>
             </w:r>
           </w:p>
         </w:tc>
@@ -1209,12 +1205,8 @@
             <w:vAlign w:val="center"/>
           </w:tcPr>
           <w:p>
-            <w:pPr>
-              <w:pStyle w:val="Normal"/>
-              <w:rPr/>
-            </w:pPr>
-            <w:r>
-              <w:rPr/>
+            <w:r>
+              <w:t>ahmadhasan943370-max</w:t>
             </w:r>
           </w:p>
         </w:tc>
@@ -1231,12 +1223,8 @@
             <w:vAlign w:val="center"/>
           </w:tcPr>
           <w:p>
-            <w:pPr>
-              <w:pStyle w:val="Normal"/>
-              <w:rPr/>
-            </w:pPr>
-            <w:r>
-              <w:rPr/>
+            <w:r>
+              <w:t>Member</w:t>
             </w:r>
           </w:p>
         </w:tc>
@@ -1253,12 +1241,8 @@
             <w:vAlign w:val="center"/>
           </w:tcPr>
           <w:p>
-            <w:pPr>
-              <w:pStyle w:val="Normal"/>
-              <w:rPr/>
-            </w:pPr>
-            <w:r>
-              <w:rPr/>
+            <w:r>
+              <w:t>task-list.html</w:t>
             </w:r>
           </w:p>
         </w:tc>
@@ -1275,12 +1259,8 @@
             <w:vAlign w:val="center"/>
           </w:tcPr>
           <w:p>
-            <w:pPr>
-              <w:pStyle w:val="Normal"/>
-              <w:rPr/>
-            </w:pPr>
-            <w:r>
-              <w:rPr/>
+            <w:r>
+              <w:t>feature/ahmadhasan943370-max/task-list</w:t>
             </w:r>
           </w:p>
         </w:tc>
@@ -1297,12 +1277,8 @@
             <w:vAlign w:val="center"/>
           </w:tcPr>
           <w:p>
-            <w:pPr>
-              <w:pStyle w:val="Normal"/>
-              <w:rPr/>
-            </w:pPr>
-            <w:r>
-              <w:rPr/>
+            <w:r>
+              <w:t>No</w:t>
             </w:r>
           </w:p>
         </w:tc>

</xml_diff>

<commit_message>
Update assignment doc with repo, Render, and Docker Hub URLs.
Co-authored-by: Cursor <cursoragent@cursor.com>
</commit_message>
<xml_diff>
--- a/DF_Assignment_04_Spring_2026.docx
+++ b/DF_Assignment_04_Spring_2026.docx
@@ -859,13 +859,8 @@
             <w:vAlign w:val="center"/>
           </w:tcPr>
           <w:p>
-            <w:pPr>
-              <w:pStyle w:val="Normal"/>
-              <w:rPr/>
-            </w:pPr>
-            <w:r>
-              <w:rPr/>
-              <w:t xml:space="preserve">Sameed Saeed </w:t>
+            <w:r>
+              <w:t>Sameed Saeed</w:t>
             </w:r>
           </w:p>
         </w:tc>
@@ -882,12 +877,7 @@
             <w:vAlign w:val="center"/>
           </w:tcPr>
           <w:p>
-            <w:pPr>
-              <w:pStyle w:val="Normal"/>
-              <w:rPr/>
-            </w:pPr>
-            <w:r>
-              <w:rPr/>
+            <w:r>
               <w:t>sameedsaeed123</w:t>
             </w:r>
           </w:p>
@@ -905,12 +895,8 @@
             <w:vAlign w:val="center"/>
           </w:tcPr>
           <w:p>
-            <w:pPr>
-              <w:pStyle w:val="Normal"/>
-              <w:rPr/>
-            </w:pPr>
-            <w:r>
-              <w:rPr/>
+            <w:r>
+              <w:t>Lead</w:t>
             </w:r>
           </w:p>
         </w:tc>
@@ -927,12 +913,8 @@
             <w:vAlign w:val="center"/>
           </w:tcPr>
           <w:p>
-            <w:pPr>
-              <w:pStyle w:val="Normal"/>
-              <w:rPr/>
-            </w:pPr>
-            <w:r>
-              <w:rPr/>
+            <w:r>
+              <w:t>index.html</w:t>
             </w:r>
           </w:p>
         </w:tc>
@@ -949,12 +931,8 @@
             <w:vAlign w:val="center"/>
           </w:tcPr>
           <w:p>
-            <w:pPr>
-              <w:pStyle w:val="Normal"/>
-              <w:rPr/>
-            </w:pPr>
-            <w:r>
-              <w:rPr/>
+            <w:r>
+              <w:t>develop</w:t>
             </w:r>
           </w:p>
         </w:tc>
@@ -971,12 +949,8 @@
             <w:vAlign w:val="center"/>
           </w:tcPr>
           <w:p>
-            <w:pPr>
-              <w:pStyle w:val="Normal"/>
-              <w:rPr/>
-            </w:pPr>
-            <w:r>
-              <w:rPr/>
+            <w:r>
+              <w:t>Yes</w:t>
             </w:r>
           </w:p>
         </w:tc>
@@ -1604,12 +1578,6 @@
         <w:rPr/>
       </w:pPr>
       <w:r>
-        <w:rPr>
-          <w:rFonts w:eastAsia="Arial" w:cs="Arial" w:ascii="Arial" w:hAnsi="Arial"/>
-          <w:b/>
-          <w:bCs/>
-          <w:color w:val="000000"/>
-        </w:rPr>
         <w:t>Group Repository URL:</w:t>
       </w:r>
     </w:p>
@@ -1630,16 +1598,6 @@
         </w:rPr>
       </w:pPr>
       <w:r>
-        <w:rPr>
-          <w:rFonts w:eastAsia="Arial" w:cs="Arial" w:ascii="Menlo;Monaco;Courier New;monospace" w:hAnsi="Menlo;Monaco;Courier New;monospace"/>
-          <w:b w:val="false"/>
-          <w:i w:val="false"/>
-          <w:caps w:val="false"/>
-          <w:smallCaps w:val="false"/>
-          <w:color w:val="81A1C1"/>
-          <w:spacing w:val="0"/>
-          <w:sz w:val="17"/>
-        </w:rPr>
         <w:t>https://github.com/sameedsaeed123/taskflow_cicd</w:t>
       </w:r>
     </w:p>
@@ -1651,13 +1609,22 @@
         <w:rPr/>
       </w:pPr>
       <w:r>
-        <w:rPr>
-          <w:rFonts w:eastAsia="Arial" w:cs="Arial" w:ascii="Arial" w:hAnsi="Arial"/>
-          <w:b/>
-          <w:bCs/>
-          <w:color w:val="000000"/>
-        </w:rPr>
         <w:t>Deployed Application URL:</w:t>
+      </w:r>
+    </w:p>
+    <w:p>
+      <w:r>
+        <w:t>https://taskflow-latest-a5zj.onrender.com</w:t>
+      </w:r>
+    </w:p>
+    <w:p>
+      <w:r>
+        <w:t>Docker Hub Image Repository URL:</w:t>
+      </w:r>
+    </w:p>
+    <w:p>
+      <w:r>
+        <w:t>https://hub.docker.com/r/sameedsaeed123/taskflow</w:t>
       </w:r>
     </w:p>
     <w:p>
@@ -1668,11 +1635,7 @@
         <w:rPr/>
       </w:pPr>
       <w:r>
-        <w:rPr>
-          <w:rFonts w:eastAsia="Arial" w:cs="Arial" w:ascii="Arial" w:hAnsi="Arial"/>
-          <w:color w:val="555555"/>
-        </w:rPr>
-        <w:t>https://taskflow-latest-a5zj.onrender.com</w:t>
+        <w:t>Docker Image Name: sameedsaeed123/taskflow:latest</w:t>
       </w:r>
     </w:p>
     <w:p>
@@ -7547,13 +7510,9 @@
         <w:rPr/>
       </w:pPr>
       <w:r>
-        <w:rPr>
-          <w:rFonts w:eastAsia="Arial" w:cs="Arial" w:ascii="Arial" w:hAnsi="Arial"/>
-          <w:color w:val="000000"/>
-        </w:rPr>
         <w:t>GitHub repository URL (must be public or shared with the instructor).</w:t>
         <w:br/>
-        <w:t>https://github.com/sameedsaeed123/taskflow_cicd.git</w:t>
+        <w:t>https://github.com/sameedsaeed123/taskflow_cicd</w:t>
       </w:r>
     </w:p>
     <w:p>
@@ -7567,10 +7526,6 @@
         <w:rPr/>
       </w:pPr>
       <w:r>
-        <w:rPr>
-          <w:rFonts w:eastAsia="Arial" w:cs="Arial" w:ascii="Arial" w:hAnsi="Arial"/>
-          <w:color w:val="000000"/>
-        </w:rPr>
         <w:t>Render live application URL.</w:t>
         <w:br/>
         <w:t>https://taskflow-latest-a5zj.onrender.com</w:t>

</xml_diff>

<commit_message>
Add about.html page - Faizyab Ahmad (Member 5)
Co-authored-by: Cursor <cursoragent@cursor.com>
</commit_message>
<xml_diff>
--- a/DF_Assignment_04_Spring_2026.docx
+++ b/DF_Assignment_04_Spring_2026.docx
@@ -1439,12 +1439,8 @@
             <w:vAlign w:val="center"/>
           </w:tcPr>
           <w:p>
-            <w:pPr>
-              <w:pStyle w:val="Normal"/>
-              <w:rPr/>
-            </w:pPr>
-            <w:r>
-              <w:rPr/>
+            <w:r>
+              <w:t>Faizyab Ahmad</w:t>
             </w:r>
           </w:p>
         </w:tc>
@@ -1461,12 +1457,8 @@
             <w:vAlign w:val="center"/>
           </w:tcPr>
           <w:p>
-            <w:pPr>
-              <w:pStyle w:val="Normal"/>
-              <w:rPr/>
-            </w:pPr>
-            <w:r>
-              <w:rPr/>
+            <w:r>
+              <w:t>L1f22bscs1111</w:t>
             </w:r>
           </w:p>
         </w:tc>
@@ -1483,12 +1475,8 @@
             <w:vAlign w:val="center"/>
           </w:tcPr>
           <w:p>
-            <w:pPr>
-              <w:pStyle w:val="Normal"/>
-              <w:rPr/>
-            </w:pPr>
-            <w:r>
-              <w:rPr/>
+            <w:r>
+              <w:t>Member</w:t>
             </w:r>
           </w:p>
         </w:tc>
@@ -1505,12 +1493,8 @@
             <w:vAlign w:val="center"/>
           </w:tcPr>
           <w:p>
-            <w:pPr>
-              <w:pStyle w:val="Normal"/>
-              <w:rPr/>
-            </w:pPr>
-            <w:r>
-              <w:rPr/>
+            <w:r>
+              <w:t>about.html</w:t>
             </w:r>
           </w:p>
         </w:tc>
@@ -1527,12 +1511,8 @@
             <w:vAlign w:val="center"/>
           </w:tcPr>
           <w:p>
-            <w:pPr>
-              <w:pStyle w:val="Normal"/>
-              <w:rPr/>
-            </w:pPr>
-            <w:r>
-              <w:rPr/>
+            <w:r>
+              <w:t>feature/L1f22bscs1111/about</w:t>
             </w:r>
           </w:p>
         </w:tc>
@@ -1549,12 +1529,8 @@
             <w:vAlign w:val="center"/>
           </w:tcPr>
           <w:p>
-            <w:pPr>
-              <w:pStyle w:val="Normal"/>
-              <w:rPr/>
-            </w:pPr>
-            <w:r>
-              <w:rPr/>
+            <w:r>
+              <w:t>No</w:t>
             </w:r>
           </w:p>
         </w:tc>

</xml_diff>